<commit_message>
Free skills page /skilli/ with five Slovenian skills as a Claude Code plugin
Plugin "ej-aj" (marketplace at the repo root, skills in skilli/ej-aj/skills/): pregled-skilla
(with a stdlib checker script), ai-v-delovni-postopek, baza-znanja-github, slovenski-slog (with a
text checker) and pravila-rabe-ai (Markdown version of our policy template). Built only from
published ej-aj.si guides, docs/slog.md and Anthropic's public skill guidance. ZIPs for the
Claude app are made by scripts/skilli-zip.mjs. Two grammar fixes in the Word policy template.
Links from the home page, the handbook, the skills guide and llms.txt.

Co-Authored-By: Claude Opus 5.5 <noreply@anthropic.com>
</commit_message>
<xml_diff>
--- a/public/predloge/pravila-rabe-ai.docx
+++ b/public/predloge/pravila-rabe-ai.docx
@@ -742,7 +742,7 @@
         <w:t xml:space="preserve">[odgovorna oseba]</w:t>
       </w:r>
       <w:r>
-        <w:t xml:space="preserve">. Pred odobritvijo preveri, ali ponudnik podatke uporablja za učenje modelov, kje (v EU ali zunaj nje) in koliko časa jih hrani in ali je z njim sklenjena pogodba o obdelavi osebnih podatkov. Pogoje odobrenih orodij pregleda vsaj enkrat na leto.</w:t>
+        <w:t xml:space="preserve">. Pred odobritvijo preveri, ali ponudnik podatke uporablja za učenje modelov, kje (v EU ali zunaj nje) in koliko časa jih hrani ter ali je z njim sklenjena pogodba o obdelavi osebnih podatkov. Pogoje odobrenih orodij pregleda vsaj enkrat na leto.</w:t>
       </w:r>
     </w:p>
     <w:p>
@@ -2300,7 +2300,7 @@
         <w:spacing w:after="120"/>
       </w:pPr>
       <w:r>
-        <w:t xml:space="preserve">Spodaj podpisani potrjujem, da sem prebral Pravila rabe orodij umetne inteligence </w:t>
+        <w:t xml:space="preserve">Spodaj podpisani potrjujem, da sem prebral(-a) Pravila rabe orodij umetne inteligence </w:t>
       </w:r>
       <w:r>
         <w:rPr>
@@ -2320,7 +2320,7 @@
         <w:t xml:space="preserve">[datum]</w:t>
       </w:r>
       <w:r>
-        <w:t xml:space="preserve">, in jih bom pri delu upošteval.</w:t>
+        <w:t xml:space="preserve">, in jih bom pri delu upošteval(-a).</w:t>
       </w:r>
     </w:p>
     <w:p>

</xml_diff>